<commit_message>
update avatar with new look from Jack
</commit_message>
<xml_diff>
--- a/notes.docx
+++ b/notes.docx
@@ -13,11 +13,9 @@
       <w:r>
         <w:t xml:space="preserve">Some online instructions on </w:t>
       </w:r>
-      <w:proofErr w:type="spellStart"/>
       <w:r>
         <w:t>Kekyll</w:t>
       </w:r>
-      <w:proofErr w:type="spellEnd"/>
     </w:p>
     <w:p>
       <w:hyperlink r:id="rId5" w:history="1">
@@ -63,15 +61,11 @@
           <w:t>https://www.cross-validated.com/Personal-website-with-Minimal-Mistakes-Jekyll-Theme-HOWTO-Part-II/</w:t>
         </w:r>
       </w:hyperlink>
-      <w:proofErr w:type="gramStart"/>
-      <w:r>
-        <w:t xml:space="preserve">   (</w:t>
-      </w:r>
-      <w:proofErr w:type="gramEnd"/>
-      <w:r>
-        <w:t>a good how-to on format)</w:t>
-      </w:r>
-    </w:p>
+      <w:r>
+        <w:t xml:space="preserve">   (a good how-to on format)</w:t>
+      </w:r>
+    </w:p>
+    <w:p/>
     <w:p/>
     <w:p>
       <w:pPr>
@@ -177,19 +171,11 @@
         <w:t xml:space="preserve">Xiao: </w:t>
       </w:r>
       <w:hyperlink r:id="rId15" w:history="1">
-        <w:proofErr w:type="spellStart"/>
         <w:r>
           <w:rPr>
             <w:rStyle w:val="Hyperlink"/>
           </w:rPr>
-          <w:t>Yuxian</w:t>
-        </w:r>
-        <w:proofErr w:type="spellEnd"/>
-        <w:r>
-          <w:rPr>
-            <w:rStyle w:val="Hyperlink"/>
-          </w:rPr>
-          <w:t xml:space="preserve"> Xiao - Home (weebly.com)</w:t>
+          <w:t>Yuxian Xiao - Home (weebly.com)</w:t>
         </w:r>
       </w:hyperlink>
     </w:p>
@@ -299,15 +285,7 @@
     </w:p>
     <w:p>
       <w:r>
-        <w:t xml:space="preserve">May need to change the </w:t>
-      </w:r>
-      <w:proofErr w:type="spellStart"/>
-      <w:r>
-        <w:t>url</w:t>
-      </w:r>
-      <w:proofErr w:type="spellEnd"/>
-      <w:r>
-        <w:t>, link in resume</w:t>
+        <w:t>May need to change the url, link in resume</w:t>
       </w:r>
     </w:p>
     <w:p>
@@ -334,7 +312,56 @@
         <w:t>Adding CV display</w:t>
       </w:r>
     </w:p>
-    <w:p/>
+    <w:p>
+      <w:r>
+        <w:lastRenderedPageBreak/>
+        <w:t>How to make url available</w:t>
+      </w:r>
+    </w:p>
+    <w:p>
+      <w:r>
+        <w:t>https://github.com/orgs/community/discussions/42375</w:t>
+      </w:r>
+    </w:p>
+    <w:p>
+      <w:r>
+        <w:drawing>
+          <wp:inline distT="0" distB="0" distL="0" distR="0" wp14:anchorId="443A92D0" wp14:editId="440ED5BD">
+            <wp:extent cx="5486400" cy="2701925"/>
+            <wp:effectExtent l="0" t="0" r="0" b="3175"/>
+            <wp:docPr id="1840563491" name="Picture 1" descr="A screenshot of a chat&#10;&#10;Description automatically generated"/>
+            <wp:cNvGraphicFramePr>
+              <a:graphicFrameLocks xmlns:a="http://schemas.openxmlformats.org/drawingml/2006/main" noChangeAspect="1"/>
+            </wp:cNvGraphicFramePr>
+            <a:graphic xmlns:a="http://schemas.openxmlformats.org/drawingml/2006/main">
+              <a:graphicData uri="http://schemas.openxmlformats.org/drawingml/2006/picture">
+                <pic:pic xmlns:pic="http://schemas.openxmlformats.org/drawingml/2006/picture">
+                  <pic:nvPicPr>
+                    <pic:cNvPr id="1840563491" name="Picture 1" descr="A screenshot of a chat&#10;&#10;Description automatically generated"/>
+                    <pic:cNvPicPr/>
+                  </pic:nvPicPr>
+                  <pic:blipFill>
+                    <a:blip r:embed="rId17"/>
+                    <a:stretch>
+                      <a:fillRect/>
+                    </a:stretch>
+                  </pic:blipFill>
+                  <pic:spPr>
+                    <a:xfrm>
+                      <a:off x="0" y="0"/>
+                      <a:ext cx="5486400" cy="2701925"/>
+                    </a:xfrm>
+                    <a:prstGeom prst="rect">
+                      <a:avLst/>
+                    </a:prstGeom>
+                  </pic:spPr>
+                </pic:pic>
+              </a:graphicData>
+            </a:graphic>
+          </wp:inline>
+        </w:drawing>
+      </w:r>
+    </w:p>
     <w:sectPr>
       <w:pgSz w:w="12240" w:h="15840"/>
       <w:pgMar w:top="1440" w:right="1800" w:bottom="1440" w:left="1800" w:header="720" w:footer="720" w:gutter="0"/>

</xml_diff>